<commit_message>
chore: francisation des libelles (Demande d'infos sup, panneau-demande-infos-sup) et DPI (Data Process et Innovation)
</commit_message>
<xml_diff>
--- a/Documentation_Plugin_Jira_Clarification_Loop.docx
+++ b/Documentation_Plugin_Jira_Clarification_Loop.docx
@@ -58,7 +58,7 @@
           <w:color w:val="6E6E6E"/>
           <w:sz w:val="23"/>
         </w:rPr>
-        <w:t>Boucle de demande de précision avec recherche globale d'utilisateurs, pièces jointes et réassignation automatique</w:t>
+        <w:t>Boucle de demande d'informations supplémentaires avec recherche globale d'utilisateurs, pièces jointes et réassignation automatique</w:t>
       </w:r>
     </w:p>
     <w:p>
@@ -78,7 +78,7 @@
           <w:color w:val="282828"/>
           <w:sz w:val="19"/>
         </w:rPr>
-        <w:t>Auteur : Etienne FOYANG (DPI - Département Projet et Innovation)  |  Cible : Jira Data Center 10.3.5 (Java 17)</w:t>
+        <w:t>Auteur : Etienne FOYANG (DPI - Data Process et Innovation)  |  Cible : Jira Data Center 10.3.5 (Java 17)</w:t>
       </w:r>
     </w:p>
     <w:p>
@@ -136,36 +136,36 @@
           <w:color w:val="282828"/>
           <w:sz w:val="21"/>
         </w:rPr>
-        <w:t>Lors de l'instruction d'un ticket Jira au sein de la banque, le collaborateur en charge (assigné) a régulièrement besoin de solliciter une précision, un arbitrage ou une pièce justificative auprès d'un autre utilisateur avant de poursuivre son traitement.</w:t>
-      </w:r>
-    </w:p>
-    <w:p>
-      <w:pPr>
-        <w:spacing w:after="80"/>
-        <w:ind w:left="360"/>
-        <w:rPr>
-          <w:rFonts w:ascii="Segoe UI" w:hAnsi="Segoe UI" w:cs="Segoe UI"/>
-          <w:color w:val="282828"/>
-          <w:sz w:val="21"/>
-        </w:rPr>
-      </w:pPr>
-      <w:r>
-        <w:rPr>
-          <w:rFonts w:ascii="Segoe UI" w:hAnsi="Segoe UI" w:cs="Segoe UI"/>
-          <w:b/>
-          <w:color w:val="C8102E"/>
-          <w:sz w:val="21"/>
-        </w:rPr>
-        <w:t xml:space="preserve">•  </w:t>
-      </w:r>
-      <w:r>
-        <w:rPr>
-          <w:rFonts w:ascii="Segoe UI" w:hAnsi="Segoe UI" w:cs="Segoe UI"/>
-          <w:b/>
-          <w:color w:val="1C1C1C"/>
-          <w:sz w:val="21"/>
-        </w:rPr>
-        <w:t xml:space="preserve">Demande (Aller) : </w:t>
+        <w:t>Lors de l'instruction d'un ticket Jira au sein de la banque, le collaborateur en charge (assigné) a régulièrement besoin de faire une demande d'informations supplémentaires, d'arbitrage ou de pièce justificative auprès d'un autre utilisateur avant de poursuivre son traitement.</w:t>
+      </w:r>
+    </w:p>
+    <w:p>
+      <w:pPr>
+        <w:spacing w:after="80"/>
+        <w:ind w:left="360"/>
+        <w:rPr>
+          <w:rFonts w:ascii="Segoe UI" w:hAnsi="Segoe UI" w:cs="Segoe UI"/>
+          <w:color w:val="282828"/>
+          <w:sz w:val="21"/>
+        </w:rPr>
+      </w:pPr>
+      <w:r>
+        <w:rPr>
+          <w:rFonts w:ascii="Segoe UI" w:hAnsi="Segoe UI" w:cs="Segoe UI"/>
+          <w:b/>
+          <w:color w:val="C8102E"/>
+          <w:sz w:val="21"/>
+        </w:rPr>
+        <w:t xml:space="preserve">•  </w:t>
+      </w:r>
+      <w:r>
+        <w:rPr>
+          <w:rFonts w:ascii="Segoe UI" w:hAnsi="Segoe UI" w:cs="Segoe UI"/>
+          <w:b/>
+          <w:color w:val="1C1C1C"/>
+          <w:sz w:val="21"/>
+        </w:rPr>
+        <w:t xml:space="preserve">Demande d'infos sup (Aller) : </w:t>
       </w:r>
       <w:r>
         <w:rPr>
@@ -427,7 +427,7 @@
           <w:color w:val="1C1C1C"/>
           <w:sz w:val="21"/>
         </w:rPr>
-        <w:t xml:space="preserve">Demander une précision : </w:t>
+        <w:t xml:space="preserve">Demande d'informations supplémentaires : </w:t>
       </w:r>
       <w:r>
         <w:rPr>
@@ -640,7 +640,7 @@
           <w:color w:val="282828"/>
           <w:sz w:val="21"/>
         </w:rPr>
-        <w:t>Déclaration des modules web-resource (clarification-resources-v3), web-panel (clarification-panel) et rest (clarification-rest).</w:t>
+        <w:t>Déclaration des modules web-resource (clarification-resources-v4), web-panel (panneau-demande-infos-sup) et rest (clarification-rest).</w:t>
       </w:r>
     </w:p>
     <w:p>

</xml_diff>